<commit_message>
Revise overview wording and grant acknowledgement
</commit_message>
<xml_diff>
--- a/LRF_SSWU_Public_Dissemination_Overview.docx
+++ b/LRF_SSWU_Public_Dissemination_Overview.docx
@@ -38,7 +38,7 @@
         <w:t xml:space="preserve"> </w:t>
       </w:r>
       <w:r>
-        <w:t xml:space="preserve">Sungshin Women’s University, School of AI Convergence</w:t>
+        <w:t xml:space="preserve">Sungshin Women's University, School of AI Convergence</w:t>
       </w:r>
       <w:r>
         <w:br/>
@@ -54,7 +54,7 @@
         <w:t xml:space="preserve"> </w:t>
       </w:r>
       <w:r>
-        <w:t xml:space="preserve">Prof. Yangjun Ahn</w:t>
+        <w:t xml:space="preserve">Prof. Yangjun Ahn</w:t>
       </w:r>
       <w:r>
         <w:br/>
@@ -86,7 +86,7 @@
         <w:t xml:space="preserve"> </w:t>
       </w:r>
       <w:r>
-        <w:t xml:space="preserve">Lloyd’s Register Foundation</w:t>
+        <w:t xml:space="preserve">Lloyd's Register Foundation</w:t>
       </w:r>
       <w:r>
         <w:br/>
@@ -102,16 +102,16 @@
         <w:t xml:space="preserve"> </w:t>
       </w:r>
       <w:r>
-        <w:t xml:space="preserve">19 October 2026 / 1.0</w:t>
+        <w:t xml:space="preserve">19 October 2026 / 1.1</w:t>
       </w:r>
     </w:p>
-    <w:bookmarkStart w:id="9" w:name="Xc8ce6d31cdd19e898b13f8efa0cf3648ead8f35"/>
+    <w:bookmarkStart w:id="9" w:name="X944024921661d36d8fb03851fd09837aff8ac87"/>
     <w:p>
       <w:pPr>
         <w:pStyle w:val="Heading2"/>
       </w:pPr>
       <w:r>
-        <w:t xml:space="preserve">1. Purpose and Public Value</w:t>
+        <w:t xml:space="preserve">1. Scope and Intended Use</w:t>
       </w:r>
     </w:p>
     <w:p>
@@ -119,7 +119,7 @@
         <w:pStyle w:val="FirstParagraph"/>
       </w:pPr>
       <w:r>
-        <w:t xml:space="preserve">This document introduces the research materials made available by Sungshin Women’s University for publication on the research centre’s website. The materials support understanding, reproduction, and further investigation of data-driven ship-motion forecasting. The public GitHub repository is the principal access point and version record [1]. It brings together source code, ship-motion datasets, an explanatory notebook, and documentation covering both theoretical foundations and practical use.</w:t>
+        <w:t xml:space="preserve">Sungshin Women's University has published the code, data, and documentation from its work on ship-motion forecasting in a public GitHub repository [1]. This overview describes the files available for the research centre's website and explains how to use them.</w:t>
       </w:r>
     </w:p>
     <w:p>
@@ -127,17 +127,25 @@
         <w:pStyle w:val="BodyText"/>
       </w:pPr>
       <w:r>
-        <w:t xml:space="preserve">The principal documented task is to predict future six-degree-of-freedom (6-DOF) ship motions—surge, sway, heave, roll, pitch, and yaw—from an observed motion history. Two complementary implementations, a bidirectional LSTM (BiLSTM) and a causal ModernTCN-style convolutional model, are provided with a shared experimental pipeline. The materials are intended for researchers, postgraduate students, educators, and engineers investigating time-series prediction and seakeeping-related analysis.</w:t>
+        <w:t xml:space="preserve">The two documented models predict six-degree-of-freedom (6-DOF) ship motions: surge, sway, heave, roll, pitch, and yaw. A bidirectional LSTM (BiLSTM) and a causal ModernTCN-style model predict a future motion sequence from an observed history. Both use the same data preparation, hyperparameter-search, and evaluation procedures. The release is intended for researchers and students working on seakeeping, naval engineering, or time-series modelling.</w:t>
+      </w:r>
+    </w:p>
+    <w:p>
+      <w:pPr>
+        <w:pStyle w:val="BodyText"/>
+      </w:pPr>
+      <w:r>
+        <w:t xml:space="preserve">The user manual gives the installation and operating instructions. The theory document explains the model designs and reports earlier experiments. The source files allow users to inspect the implementation and run their own experiments.</w:t>
       </w:r>
     </w:p>
     <w:bookmarkEnd w:id="9"/>
-    <w:bookmarkStart w:id="10" w:name="Xba0bdd72ba91ca775facb43f309475c808e6fd4"/>
+    <w:bookmarkStart w:id="10" w:name="X395faa9546b2d214dfb0a2bad568787f68ded9f"/>
     <w:p>
       <w:pPr>
         <w:pStyle w:val="Heading2"/>
       </w:pPr>
       <w:r>
-        <w:t xml:space="preserve">2. Materials and File Formats</w:t>
+        <w:t xml:space="preserve">2. Available Materials</w:t>
       </w:r>
     </w:p>
     <w:tbl>
@@ -189,7 +197,7 @@
                 <w:b/>
                 <w:sz w:val="16"/>
               </w:rPr>
-              <w:t xml:space="preserve">Purpose and contents</w:t>
+              <w:t xml:space="preserve">Contents</w:t>
             </w:r>
           </w:p>
         </w:tc>
@@ -207,7 +215,7 @@
                 <w:b/>
                 <w:sz w:val="16"/>
               </w:rPr>
-              <w:t xml:space="preserve">Format / access</w:t>
+              <w:t xml:space="preserve">Format / location</w:t>
             </w:r>
           </w:p>
         </w:tc>
@@ -224,7 +232,7 @@
               <w:rPr>
                 <w:sz w:val="16"/>
               </w:rPr>
-              <w:t xml:space="preserve">Public repository</w:t>
+              <w:t xml:space="preserve">GitHub repository</w:t>
             </w:r>
           </w:p>
         </w:tc>
@@ -239,7 +247,7 @@
               <w:rPr>
                 <w:sz w:val="16"/>
               </w:rPr>
-              <w:t xml:space="preserve">Versioned entry point, project description, directory structure, and links to all release materials.</w:t>
+              <w:t xml:space="preserve">Project description, file index, source history, and download links.</w:t>
             </w:r>
           </w:p>
         </w:tc>
@@ -296,7 +304,7 @@
               <w:rPr>
                 <w:sz w:val="16"/>
               </w:rPr>
-              <w:t xml:space="preserve">Final training implementations</w:t>
+              <w:t xml:space="preserve">Final training scripts</w:t>
             </w:r>
           </w:p>
         </w:tc>
@@ -343,7 +351,7 @@
               <w:rPr>
                 <w:sz w:val="16"/>
               </w:rPr>
-              <w:t xml:space="preserve">: loading, preprocessing, model construction, hyperparameter search, training, evaluation, and plotting.</w:t>
+              <w:t xml:space="preserve">. Each script reads data, constructs and trains a model, searches hyperparameters, evaluates predictions, and saves results.</w:t>
             </w:r>
           </w:p>
         </w:tc>
@@ -358,7 +366,7 @@
               <w:rPr>
                 <w:sz w:val="16"/>
               </w:rPr>
-              <w:t xml:space="preserve">Python source (</w:t>
+              <w:t xml:space="preserve">Python (</w:t>
             </w:r>
             <w:r>
               <w:rPr>
@@ -388,7 +396,7 @@
               <w:rPr>
                 <w:sz w:val="16"/>
               </w:rPr>
-              <w:t xml:space="preserve">Detailed code review and user manual</w:t>
+              <w:t xml:space="preserve">Code review and user manual</w:t>
             </w:r>
           </w:p>
         </w:tc>
@@ -403,7 +411,7 @@
               <w:rPr>
                 <w:sz w:val="16"/>
               </w:rPr>
-              <w:t xml:space="preserve">Function and tensor explanations, installation, data preparation, training, interruption/resumption, inference, troubleshooting, and improvement recommendations. English and Korean editions.</w:t>
+              <w:t xml:space="preserve">Explanations of functions and tensor shapes; installation, data preparation, training, resumption, inference, troubleshooting, and proposed corrections. English and Korean editions.</w:t>
             </w:r>
           </w:p>
         </w:tc>
@@ -418,7 +426,7 @@
               <w:rPr>
                 <w:sz w:val="16"/>
               </w:rPr>
-              <w:t xml:space="preserve">Markdown and PDF; English Word edition [2]</w:t>
+              <w:t xml:space="preserve">Markdown and PDF; English Word file [2]</w:t>
             </w:r>
           </w:p>
         </w:tc>
@@ -435,7 +443,7 @@
               <w:rPr>
                 <w:sz w:val="16"/>
               </w:rPr>
-              <w:t xml:space="preserve">Theory and previous experiments</w:t>
+              <w:t xml:space="preserve">Theory and earlier experiments</w:t>
             </w:r>
           </w:p>
         </w:tc>
@@ -457,7 +465,7 @@
               <w:rPr>
                 <w:sz w:val="16"/>
               </w:rPr>
-              <w:t xml:space="preserve">: forecasting formulation, architecture diagrams, normalization, optimization, search spaces, metrics, and historical results.</w:t>
+              <w:t xml:space="preserve">. Forecasting formulation, architecture diagrams, normalization, optimization, search spaces, metrics, and previous results.</w:t>
             </w:r>
           </w:p>
         </w:tc>
@@ -489,7 +497,7 @@
               <w:rPr>
                 <w:sz w:val="16"/>
               </w:rPr>
-              <w:t xml:space="preserve">Supporting research assets</w:t>
+              <w:t xml:space="preserve">Data and supporting analyses</w:t>
             </w:r>
           </w:p>
         </w:tc>
@@ -502,6 +510,18 @@
             </w:pPr>
             <w:r>
               <w:rPr>
+                <w:sz w:val="16"/>
+              </w:rPr>
+              <w:t xml:space="preserve">Motion and wave files in</w:t>
+            </w:r>
+            <w:r>
+              <w:rPr>
+                <w:sz w:val="16"/>
+              </w:rPr>
+              <w:t xml:space="preserve"> </w:t>
+            </w:r>
+            <w:r>
+              <w:rPr>
                 <w:rStyle w:val="VerbatimChar"/>
                 <w:sz w:val="16"/>
               </w:rPr>
@@ -511,7 +531,13 @@
               <w:rPr>
                 <w:sz w:val="16"/>
               </w:rPr>
-              <w:t xml:space="preserve">,</w:t>
+              <w:t xml:space="preserve"> </w:t>
+            </w:r>
+            <w:r>
+              <w:rPr>
+                <w:sz w:val="16"/>
+              </w:rPr>
+              <w:t xml:space="preserve">and</w:t>
             </w:r>
             <w:r>
               <w:rPr>
@@ -530,7 +556,7 @@
               <w:rPr>
                 <w:sz w:val="16"/>
               </w:rPr>
-              <w:t xml:space="preserve">,</w:t>
+              <w:t xml:space="preserve">; the comparison notebook</w:t>
             </w:r>
             <w:r>
               <w:rPr>
@@ -549,7 +575,7 @@
               <w:rPr>
                 <w:sz w:val="16"/>
               </w:rPr>
-              <w:t xml:space="preserve">, and an earlier Causal ModernTCN analysis report.</w:t>
+              <w:t xml:space="preserve">; and an earlier Causal ModernTCN analysis report.</w:t>
             </w:r>
           </w:p>
         </w:tc>
@@ -564,7 +590,7 @@
               <w:rPr>
                 <w:sz w:val="16"/>
               </w:rPr>
-              <w:t xml:space="preserve">CSV/OUT data, Jupyter notebook, Markdown [1]</w:t>
+              <w:t xml:space="preserve">CSV/OUT, Jupyter notebook, Markdown [1]</w:t>
             </w:r>
           </w:p>
         </w:tc>
@@ -575,7 +601,7 @@
         <w:pStyle w:val="BodyText"/>
       </w:pPr>
       <w:r>
-        <w:t xml:space="preserve">Together, the theory document explains the scientific design, the manual explains how the implementation behaves and how to use it, and the repository supplies the files needed to inspect and conduct experiments. This overview is supplied in PDF and editable Word formats for direct use by the research centre.</w:t>
+        <w:t xml:space="preserve">This overview is provided as a PDF for publication and a Word file for editing. Section 5 lists the documents to upload and the repository link for access to code and data.</w:t>
       </w:r>
     </w:p>
     <w:p>
@@ -584,13 +610,13 @@
       </w:r>
     </w:p>
     <w:bookmarkEnd w:id="10"/>
-    <w:bookmarkStart w:id="11" w:name="X997bac5b26c94add5556200de60989bd8c578cc"/>
+    <w:bookmarkStart w:id="11" w:name="Xde2c5daf73ac8025a34f5e8fba9ac323db885cf"/>
     <w:p>
       <w:pPr>
         <w:pStyle w:val="Heading2"/>
       </w:pPr>
       <w:r>
-        <w:t xml:space="preserve">3. Scientific and Technical Content</w:t>
+        <w:t xml:space="preserve">3. Forecasting Methods</w:t>
       </w:r>
     </w:p>
     <w:p>
@@ -602,13 +628,13 @@
           <w:b/>
           <w:bCs/>
         </w:rPr>
-        <w:t xml:space="preserve">Prediction problem.</w:t>
+        <w:t xml:space="preserve">Inputs and outputs.</w:t>
       </w:r>
       <w:r>
         <w:t xml:space="preserve"> </w:t>
       </w:r>
       <w:r>
-        <w:t xml:space="preserve">Both final scripts use six motion channels jointly. Their default configuration takes 128 samples of history and predicts 128 future samples in one forward pass. At the assumed 2 Hz sampling rate, future lead times run from 0.5 to 64 seconds after the last observation; window starts advance by 16 samples. Translations are represented in metres and rotations in degrees.</w:t>
+        <w:t xml:space="preserve">The default configuration uses 128 observed samples to predict the next 128 samples of all six motion channels in one forward pass. At the assumed sampling rate of 2 Hz, the forecast covers lead times from 0.5 to 64 seconds after the last observation. Window starts advance by 16 samples. Translations are expressed in metres and rotations in degrees.</w:t>
       </w:r>
     </w:p>
     <w:p>
@@ -620,13 +646,13 @@
           <w:b/>
           <w:bCs/>
         </w:rPr>
-        <w:t xml:space="preserve">Complementary architectures.</w:t>
+        <w:t xml:space="preserve">Model structures.</w:t>
       </w:r>
       <w:r>
         <w:t xml:space="preserve"> </w:t>
       </w:r>
       <w:r>
-        <w:t xml:space="preserve">The BiLSTM encodes the observed window in both directions and concatenates the last layer’s final forward/backward states before a linear forecast head. Its backward pass reads only already observed history. The causal ModernTCN implementation uses left-padded depthwise temporal convolutions, per-time-step channel normalization, pointwise channel mixing, residual connections, and a temporal projection head. The head uses the complete observed window. It is the project’s specific causal implementation, rather than a claim of exact reproduction of the general ModernTCN architecture [4,5].</w:t>
+        <w:t xml:space="preserve">The BiLSTM processes the observed window in both directions. The final forward and backward hidden states of its last layer are concatenated and passed to a linear forecast head. Both directions read only the observed history. The causal ModernTCN model uses left-padded depthwise temporal convolutions, channel normalization at each time step, pointwise channel mixing, and residual connections. Its temporal projection head uses features from the complete observed window. The theory document describes this project's causal variant; the original LSTM and ModernTCN papers provide the methodological background [3–5].</w:t>
       </w:r>
     </w:p>
     <w:p>
@@ -638,23 +664,23 @@
           <w:b/>
           <w:bCs/>
         </w:rPr>
-        <w:t xml:space="preserve">Common experimental procedure.</w:t>
+        <w:t xml:space="preserve">Training and evaluation.</w:t>
       </w:r>
       <w:r>
         <w:t xml:space="preserve"> </w:t>
       </w:r>
       <w:r>
-        <w:t xml:space="preserve">Files are split into training, validation, and test sets before windows are generated. Per-channel z-score statistics are fitted to training data only. Optuna explores architecture and training settings using validation MSE, TPE sampling, and median pruning [6]. Defaults allow 40 trials with up to 40 epochs each. A new model is then initialized with the selected settings and trained for up to 300 epochs on the original training split, retaining validation for checkpoint selection and early stopping. AdamW, learning-rate reduction, and gradient norm clipping are used. Test reporting includes standardized MSE/MAE and per-DOF RMSE in physical units.</w:t>
+        <w:t xml:space="preserve">Data are split by file into training, validation, and test sets before windows are generated. Channel means and standard deviations are calculated from training data only. Optuna searches model and training settings using validation MSE, TPE sampling, and median pruning [6]. The default budget is 40 trials, each with up to 40 epochs. The selected configuration is then trained from a fresh initialization for up to 300 epochs. Training and validation remain separate. AdamW updates the weights; validation loss controls learning-rate reduction, early stopping, and checkpoint selection. Gradients are clipped by norm. Test results include MSE and MAE in standardized space and per-DOF RMSE in physical units.</w:t>
       </w:r>
     </w:p>
     <w:bookmarkEnd w:id="11"/>
-    <w:bookmarkStart w:id="12" w:name="X2a92211d247d808e6aadadff60df5086917e33d"/>
+    <w:bookmarkStart w:id="12" w:name="Xcc696b2536f1faa86d08986116ece08343a19d3"/>
     <w:p>
       <w:pPr>
         <w:pStyle w:val="Heading2"/>
       </w:pPr>
       <w:r>
-        <w:t xml:space="preserve">4. Using the Materials</w:t>
+        <w:t xml:space="preserve">4. Running an Experiment</w:t>
       </w:r>
     </w:p>
     <w:p>
@@ -670,13 +696,13 @@
           <w:b/>
           <w:bCs/>
         </w:rPr>
-        <w:t xml:space="preserve">Read and obtain files.</w:t>
+        <w:t xml:space="preserve">Obtain the files.</w:t>
       </w:r>
       <w:r>
         <w:t xml:space="preserve"> </w:t>
       </w:r>
       <w:r>
-        <w:t xml:space="preserve">Start with the repository README, then consult the English user manual [2] and the theory document [3]. Clone or download the repository; the Korean manual provides an additional reading option.</w:t>
+        <w:t xml:space="preserve">Clone or download the repository. Read the setup instructions in the English manual [2] and the model explanation in the theory PDF [3]. A Korean manual is also available.</w:t>
       </w:r>
     </w:p>
     <w:p>
@@ -692,13 +718,13 @@
           <w:b/>
           <w:bCs/>
         </w:rPr>
-        <w:t xml:space="preserve">Prepare compatible data.</w:t>
+        <w:t xml:space="preserve">Prepare the data.</w:t>
       </w:r>
       <w:r>
         <w:t xml:space="preserve"> </w:t>
       </w:r>
       <w:r>
-        <w:t xml:space="preserve">Create motion CSVs with</w:t>
+        <w:t xml:space="preserve">Supply finite motion values in columns</w:t>
       </w:r>
       <w:r>
         <w:t xml:space="preserve"> </w:t>
@@ -719,10 +745,7 @@
         <w:t xml:space="preserve">x6</w:t>
       </w:r>
       <w:r>
-        <w:t xml:space="preserve"> </w:t>
-      </w:r>
-      <w:r>
-        <w:t xml:space="preserve">in the documented order, finite values, and a verified 0.5-second sampling interval. Each training file requires at least 256 rows. Set</w:t>
+        <w:t xml:space="preserve">, in the documented order, at 0.5-second intervals. Each training file needs at least 256 rows. Set</w:t>
       </w:r>
       <w:r>
         <w:t xml:space="preserve"> </w:t>
@@ -737,7 +760,7 @@
         <w:t xml:space="preserve"> </w:t>
       </w:r>
       <w:r>
-        <w:t xml:space="preserve">or prepare</w:t>
+        <w:t xml:space="preserve">or place the files in</w:t>
       </w:r>
       <w:r>
         <w:t xml:space="preserve"> </w:t>
@@ -749,7 +772,7 @@
         <w:t xml:space="preserve">csv_dataset/</w:t>
       </w:r>
       <w:r>
-        <w:t xml:space="preserve">. Repository data folders can have different sampling intervals and exported column labels; validate and preprocess each source before use.</w:t>
+        <w:t xml:space="preserve">. The published data folders contain different sampling intervals and exported headers; check these and preprocess the data before training. The scripts exclude files beginning with</w:t>
       </w:r>
       <w:r>
         <w:t xml:space="preserve"> </w:t>
@@ -761,10 +784,7 @@
         <w:t xml:space="preserve">Wave_</w:t>
       </w:r>
       <w:r>
-        <w:t xml:space="preserve"> </w:t>
-      </w:r>
-      <w:r>
-        <w:t xml:space="preserve">files are excluded by the final scripts.</w:t>
+        <w:t xml:space="preserve">.</w:t>
       </w:r>
     </w:p>
     <w:p>
@@ -780,13 +800,13 @@
           <w:b/>
           <w:bCs/>
         </w:rPr>
-        <w:t xml:space="preserve">Set up and run.</w:t>
+        <w:t xml:space="preserve">Check the environment and run.</w:t>
       </w:r>
       <w:r>
         <w:t xml:space="preserve"> </w:t>
       </w:r>
       <w:r>
-        <w:t xml:space="preserve">Follow the manual’s verified Python/PyTorch dependency guidance, preflight checks, and reduced synthetic example before a full experiment. CPU execution is supported; CUDA is selected when available. Give each experiment a distinct output path.</w:t>
+        <w:t xml:space="preserve">Follow the manual's Python/PyTorch setup, data checks, and short synthetic-data example. The scripts select CUDA when available and otherwise use the CPU. Use a separate output path for each experiment.</w:t>
       </w:r>
     </w:p>
     <w:p>
@@ -802,13 +822,13 @@
           <w:b/>
           <w:bCs/>
         </w:rPr>
-        <w:t xml:space="preserve">Inspect and reuse outputs.</w:t>
+        <w:t xml:space="preserve">Keep the results together.</w:t>
       </w:r>
       <w:r>
         <w:t xml:space="preserve"> </w:t>
       </w:r>
       <w:r>
-        <w:t xml:space="preserve">Preserve the best model weights, scaler and split lists, hyperparameters, SQLite trial database, training history, metrics, and prediction plots together. The manual includes a saved-model inference example. Final trained weights are generated by running the pipeline and are not included in this documented release.</w:t>
+        <w:t xml:space="preserve">Save the best weights, scaler, split lists, hyperparameters, trial database, training history, metrics, and plots. The manual shows how to reload a saved model for inference. Trained weights are produced by the scripts and are not supplied with this release.</w:t>
       </w:r>
     </w:p>
     <w:p>
@@ -820,13 +840,13 @@
           <w:b/>
           <w:bCs/>
         </w:rPr>
-        <w:t xml:space="preserve">Interpretation and validation.</w:t>
+        <w:t xml:space="preserve">Current limitations.</w:t>
       </w:r>
       <w:r>
         <w:t xml:space="preserve"> </w:t>
       </w:r>
       <w:r>
-        <w:t xml:space="preserve">The manual records synthetic end-to-end checks and identifies implementation issues, including equal weighting of unequal evaluation batches and ModernTCN’s handling of historical interruption flags. Proposed fixes are documented but have not been applied to the final source scripts. Historical scores in the theory PDF are separate from those checks; the full real-data search has not been newly reproduced during documentation preparation. These scripts provide point forecasts, without implemented uncertainty intervals or a validated operational control system.</w:t>
+        <w:t xml:space="preserve">The manual reports short synthetic-data runs and documents two issues that affect experimental use: unequal evaluation batches receive equal weight, and an earlier interruption flag can cause ModernTCN to skip final training on a later run. Corrections are proposed in the manual but have not been applied to the published scripts. The earlier results in the theory PDF were not rerun during documentation preparation. The scripts return point forecasts; prediction intervals are not implemented.</w:t>
       </w:r>
     </w:p>
     <w:p>
@@ -835,13 +855,13 @@
       </w:r>
     </w:p>
     <w:bookmarkEnd w:id="12"/>
-    <w:bookmarkStart w:id="13" w:name="X85b451c6473d0105e54a34e9299578f992432c8"/>
+    <w:bookmarkStart w:id="13" w:name="X8060517c4bcd15b94318f69d15152b6167ac69d"/>
     <w:p>
       <w:pPr>
         <w:pStyle w:val="Heading2"/>
       </w:pPr>
       <w:r>
-        <w:t xml:space="preserve">5. Access, Website Publication, and Version Identification</w:t>
+        <w:t xml:space="preserve">5. Distribution and Citation</w:t>
       </w:r>
     </w:p>
     <w:p>
@@ -849,7 +869,7 @@
         <w:pStyle w:val="FirstParagraph"/>
       </w:pPr>
       <w:r>
-        <w:t xml:space="preserve">The repository README is the recommended landing page [1]. It links directly to the two final training scripts, both language editions of the user manual, the theory PDF, and this overview. Markdown files support browser reading and version comparison; PDF files support stable reading and printing; the English Word files support editorial preparation.</w:t>
+        <w:t xml:space="preserve">The README links to the training scripts, English and Korean manuals, theory PDF, and this overview [1]. Readers can view the Markdown documents on GitHub, download the PDFs, or use the English Word files when preparing edited documents.</w:t>
       </w:r>
     </w:p>
     <w:p>
@@ -857,7 +877,7 @@
         <w:pStyle w:val="BodyText"/>
       </w:pPr>
       <w:r>
-        <w:t xml:space="preserve">For research-centre publication, the accompanying files are organised as follows:</w:t>
+        <w:t xml:space="preserve">The following files are available for publication on the research centre's website:</w:t>
       </w:r>
     </w:p>
     <w:tbl>
@@ -890,7 +910,7 @@
                 <w:b/>
                 <w:sz w:val="16"/>
               </w:rPr>
-              <w:t xml:space="preserve">Publication item</w:t>
+              <w:t xml:space="preserve">Item</w:t>
             </w:r>
           </w:p>
         </w:tc>
@@ -925,7 +945,7 @@
               <w:rPr>
                 <w:sz w:val="16"/>
               </w:rPr>
-              <w:t xml:space="preserve">Overview for the website</w:t>
+              <w:t xml:space="preserve">Public-materials overview</w:t>
             </w:r>
           </w:p>
         </w:tc>
@@ -983,7 +1003,7 @@
               <w:rPr>
                 <w:sz w:val="16"/>
               </w:rPr>
-              <w:t xml:space="preserve">Theory explanation</w:t>
+              <w:t xml:space="preserve">Theory document</w:t>
             </w:r>
           </w:p>
         </w:tc>
@@ -1016,7 +1036,7 @@
               <w:rPr>
                 <w:sz w:val="16"/>
               </w:rPr>
-              <w:t xml:space="preserve">English user documentation</w:t>
+              <w:t xml:space="preserve">English user manual</w:t>
             </w:r>
           </w:p>
         </w:tc>
@@ -1093,7 +1113,7 @@
               <w:rPr>
                 <w:sz w:val="16"/>
               </w:rPr>
-              <w:t xml:space="preserve">Korean user documentation</w:t>
+              <w:t xml:space="preserve">Korean user manual</w:t>
             </w:r>
           </w:p>
         </w:tc>
@@ -1145,7 +1165,7 @@
               <w:rPr>
                 <w:sz w:val="16"/>
               </w:rPr>
-              <w:t xml:space="preserve">Training source and supporting datasets/notebook</w:t>
+              <w:t xml:space="preserve">Training scripts, data, and notebook</w:t>
             </w:r>
           </w:p>
         </w:tc>
@@ -1160,7 +1180,7 @@
               <w:rPr>
                 <w:sz w:val="16"/>
               </w:rPr>
-              <w:t xml:space="preserve">Repository download or direct links through the README [1]</w:t>
+              <w:t xml:space="preserve">Repository download or individual links in the README [1]</w:t>
             </w:r>
           </w:p>
         </w:tc>
@@ -1171,7 +1191,7 @@
         <w:pStyle w:val="BodyText"/>
       </w:pPr>
       <w:r>
-        <w:t xml:space="preserve">The overview and principal explanatory PDFs can be hosted directly on the research-centre website, with a link to GitHub for source code, data, and subsequent revisions. To make a reported experiment traceable, record the repository commit, actual data files and preprocessing, split lists, settings, and software environment. The final training-code baseline reviewed in the manual is commit</w:t>
+        <w:t xml:space="preserve">The centre can host the overview, theory document, and manuals and link to GitHub for code, data, and later revisions. The final training scripts reviewed in the manual are identified by commit</w:t>
       </w:r>
       <w:r>
         <w:t xml:space="preserve"> </w:t>
@@ -1183,17 +1203,25 @@
         <w:t xml:space="preserve">31988e994fe6d35e1308760700ecbd2e4f3ec647</w:t>
       </w:r>
       <w:r>
-        <w:t xml:space="preserve">; the repository history identifies later documentation updates. Users citing the materials should include the institution, document title, repository URL, and the revision or access date used. Third-party dependencies retain their own attribution and licensing information.</w:t>
+        <w:t xml:space="preserve">. Later documentation changes are recorded in the repository history.</w:t>
+      </w:r>
+    </w:p>
+    <w:p>
+      <w:pPr>
+        <w:pStyle w:val="BodyText"/>
+      </w:pPr>
+      <w:r>
+        <w:t xml:space="preserve">For each experiment, record the code commit, data files, preprocessing, split lists, settings, and software versions. A citation to these materials should identify the institution, document title, repository URL, and the revision or access date. Third-party software has its own attribution and licence information.</w:t>
       </w:r>
     </w:p>
     <w:bookmarkEnd w:id="13"/>
-    <w:bookmarkStart w:id="20" w:name="Xfeba1690dc50adb7b8c42c5f38fc8cbc0cb241f"/>
+    <w:bookmarkStart w:id="20" w:name="X37afd669346d4c91657a0928e7ee770faa8e6b0"/>
     <w:p>
       <w:pPr>
         <w:pStyle w:val="Heading2"/>
       </w:pPr>
       <w:r>
-        <w:t xml:space="preserve">6. References and Further Reading</w:t>
+        <w:t xml:space="preserve">6. References</w:t>
       </w:r>
     </w:p>
     <w:p>
@@ -1211,7 +1239,7 @@
         <w:t xml:space="preserve"> </w:t>
       </w:r>
       <w:r>
-        <w:t xml:space="preserve">Sungshin Women’s University.</w:t>
+        <w:t xml:space="preserve">Sungshin Women's University.</w:t>
       </w:r>
       <w:r>
         <w:t xml:space="preserve"> </w:t>
@@ -1227,7 +1255,7 @@
         <w:t xml:space="preserve"> </w:t>
       </w:r>
       <w:r>
-        <w:t xml:space="preserve">Project information, source code, datasets, notebook, and release index.</w:t>
+        <w:t xml:space="preserve">Code, data, documentation, and project information.</w:t>
       </w:r>
       <w:r>
         <w:br/>
@@ -1266,7 +1294,7 @@
         <w:t xml:space="preserve"> </w:t>
       </w:r>
       <w:r>
-        <w:t xml:space="preserve">English edition, 19 October 2026; Korean translation and downloadable formats linked from the README.</w:t>
+        <w:t xml:space="preserve">English edition, 19 October 2026. The README also links to the Korean edition and downloadable files.</w:t>
       </w:r>
       <w:r>
         <w:br/>
@@ -1305,7 +1333,7 @@
         <w:t xml:space="preserve"> </w:t>
       </w:r>
       <w:r>
-        <w:t xml:space="preserve">Theory and prior experiments, 9 pages.</w:t>
+        <w:t xml:space="preserve">Theory and earlier experiments, 9 pages.</w:t>
       </w:r>
       <w:r>
         <w:br/>
@@ -1424,7 +1452,7 @@
         <w:t xml:space="preserve"> </w:t>
       </w:r>
       <w:r>
-        <w:t xml:space="preserve">Akiba, T., et al. (2019). Optuna: A Next-generation Hyperparameter Optimization Framework.</w:t>
+        <w:t xml:space="preserve">Akiba, T., et al. (2019). Optuna: A Next-generation Hyperparameter Optimization Framework.</w:t>
       </w:r>
       <w:r>
         <w:t xml:space="preserve"> </w:t>
@@ -1469,7 +1497,7 @@
         <w:t xml:space="preserve"> </w:t>
       </w:r>
       <w:r>
-        <w:t xml:space="preserve">These materials were developed by Sungshin Women’s University as a joint research institution under the project led by Seoul National University and supported by the Lloyd’s Register Foundation. Scientific and implementation details should be read together with the linked source and documentation.</w:t>
+        <w:t xml:space="preserve">This research has been also performed under the supported of the Lloyd's Register Foundation, Grant No. CGY 100002.</w:t>
       </w:r>
     </w:p>
     <w:bookmarkEnd w:id="20"/>

</xml_diff>